<commit_message>
Edit french version of the README_fr.md
</commit_message>
<xml_diff>
--- a/docs/markdown_fr.docx
+++ b/docs/markdown_fr.docx
@@ -63,13 +63,198 @@
       <w:r>
         <w:t>Présentation du logiciel</w:t>
       </w:r>
+      <w:r>
+        <w:t>.</w:t>
+      </w:r>
+    </w:p>
+    <w:p>
+      <w:r>
+        <w:t>Cette application est basée sur un langage qui permet de décrire les différentes actions d’un match de baseball en utilisant un langage dédié. Pour cela l’application permet d’éditer la composition des clubs engagés dans un championnat et d’un deuxième éditeur permettant de décrire toutes les actions dans un match.  Cette application se présente sous la forme suivante :</w:t>
+      </w:r>
+    </w:p>
+    <w:p>
+      <w:r>
+        <w:rPr>
+          <w:noProof/>
+        </w:rPr>
+        <w:drawing>
+          <wp:inline distT="0" distB="0" distL="0" distR="0" wp14:anchorId="798198D6" wp14:editId="662D7D62">
+            <wp:extent cx="5760720" cy="3600450"/>
+            <wp:effectExtent l="0" t="0" r="0" b="0"/>
+            <wp:docPr id="1282888834" name="Image 1"/>
+            <wp:cNvGraphicFramePr>
+              <a:graphicFrameLocks xmlns:a="http://schemas.openxmlformats.org/drawingml/2006/main" noChangeAspect="1"/>
+            </wp:cNvGraphicFramePr>
+            <a:graphic xmlns:a="http://schemas.openxmlformats.org/drawingml/2006/main">
+              <a:graphicData uri="http://schemas.openxmlformats.org/drawingml/2006/picture">
+                <pic:pic xmlns:pic="http://schemas.openxmlformats.org/drawingml/2006/picture">
+                  <pic:nvPicPr>
+                    <pic:cNvPr id="1282888834" name=""/>
+                    <pic:cNvPicPr/>
+                  </pic:nvPicPr>
+                  <pic:blipFill>
+                    <a:blip r:embed="rId5"/>
+                    <a:stretch>
+                      <a:fillRect/>
+                    </a:stretch>
+                  </pic:blipFill>
+                  <pic:spPr>
+                    <a:xfrm>
+                      <a:off x="0" y="0"/>
+                      <a:ext cx="5760720" cy="3600450"/>
+                    </a:xfrm>
+                    <a:prstGeom prst="rect">
+                      <a:avLst/>
+                    </a:prstGeom>
+                  </pic:spPr>
+                </pic:pic>
+              </a:graphicData>
+            </a:graphic>
+          </wp:inline>
+        </w:drawing>
+      </w:r>
+    </w:p>
+    <w:p>
+      <w:r>
+        <w:t>Cette application contient plusieurs vues dont principalement :</w:t>
+      </w:r>
+    </w:p>
+    <w:p>
+      <w:pPr>
+        <w:pStyle w:val="Paragraphedeliste"/>
+        <w:numPr>
+          <w:ilvl w:val="0"/>
+          <w:numId w:val="1"/>
+        </w:numPr>
+      </w:pPr>
+      <w:r>
+        <w:t>La zone d’édition</w:t>
+      </w:r>
+    </w:p>
+    <w:p>
+      <w:pPr>
+        <w:pStyle w:val="Paragraphedeliste"/>
+        <w:numPr>
+          <w:ilvl w:val="0"/>
+          <w:numId w:val="1"/>
+        </w:numPr>
+      </w:pPr>
+      <w:r>
+        <w:t>Une fenêtre permettant de voir des erreurs ou avertissements les informations saisies</w:t>
+      </w:r>
+    </w:p>
+    <w:p>
+      <w:pPr>
+        <w:pStyle w:val="Paragraphedeliste"/>
+        <w:numPr>
+          <w:ilvl w:val="0"/>
+          <w:numId w:val="1"/>
+        </w:numPr>
+      </w:pPr>
+      <w:r>
+        <w:t>Une vue de l’</w:t>
+      </w:r>
+      <w:proofErr w:type="spellStart"/>
+      <w:r>
+        <w:t>infield</w:t>
+      </w:r>
+      <w:proofErr w:type="spellEnd"/>
+      <w:r>
+        <w:t xml:space="preserve"> avec le nom et position des joueurs</w:t>
+      </w:r>
+    </w:p>
+    <w:p>
+      <w:pPr>
+        <w:pStyle w:val="Paragraphedeliste"/>
+        <w:numPr>
+          <w:ilvl w:val="0"/>
+          <w:numId w:val="1"/>
+        </w:numPr>
+      </w:pPr>
+      <w:r>
+        <w:lastRenderedPageBreak/>
+        <w:t>Le line up actif</w:t>
+      </w:r>
+    </w:p>
+    <w:p>
+      <w:pPr>
+        <w:pStyle w:val="Paragraphedeliste"/>
+        <w:numPr>
+          <w:ilvl w:val="0"/>
+          <w:numId w:val="1"/>
+        </w:numPr>
+      </w:pPr>
+      <w:r>
+        <w:t>Un gestionnaire de projet</w:t>
+      </w:r>
+    </w:p>
+    <w:p>
+      <w:pPr>
+        <w:pStyle w:val="Paragraphedeliste"/>
+        <w:numPr>
+          <w:ilvl w:val="0"/>
+          <w:numId w:val="1"/>
+        </w:numPr>
+      </w:pPr>
+      <w:r>
+        <w:t>Un tableau d’affichage</w:t>
+      </w:r>
+    </w:p>
+    <w:p>
+      <w:pPr>
+        <w:pStyle w:val="Paragraphedeliste"/>
+        <w:numPr>
+          <w:ilvl w:val="0"/>
+          <w:numId w:val="1"/>
+        </w:numPr>
+      </w:pPr>
+      <w:r>
+        <w:t>Une vue graphique (en temps réel de la feuille de scorage)</w:t>
+      </w:r>
+    </w:p>
+    <w:p>
+      <w:pPr>
+        <w:pStyle w:val="Paragraphedeliste"/>
+      </w:pPr>
+    </w:p>
+    <w:p>
+      <w:r>
+        <w:t>Lorsque le match est saisi, il est ensuite possible d’exporter les feuilles de scorage au format PDF.</w:t>
+      </w:r>
+    </w:p>
+    <w:p>
+      <w:r>
+        <w:t xml:space="preserve">L’utilisation de ce logiciel est décrite dans l’aide qui est accessible via le menu </w:t>
+      </w:r>
+      <w:r>
+        <w:t>« Aide »</w:t>
+      </w:r>
+      <w:r>
+        <w:t xml:space="preserve">. Cette aide comprend le manuel utilisateur de l’application et le manuel de scorage rédigé par Anna Maria PAINI. </w:t>
+      </w:r>
     </w:p>
     <w:p>
       <w:pPr>
         <w:pStyle w:val="Titre2"/>
       </w:pPr>
       <w:r>
-        <w:t>Fonctionnalités</w:t>
+        <w:t>Installation/ Utilisation</w:t>
+      </w:r>
+      <w:r>
+        <w:t>.</w:t>
+      </w:r>
+    </w:p>
+    <w:p>
+      <w:pPr>
+        <w:rPr>
+          <w:color w:val="EE0000"/>
+        </w:rPr>
+      </w:pPr>
+      <w:r>
+        <w:t xml:space="preserve">Ce logiciel est livré sous la forme d’un fichier ZIP que vous devrez dézipper dans un répertoire de votre choix. Pour lancer l’application, vous pourrez créer un raccourci sur bureau pointant sur le fichier </w:t>
+      </w:r>
+      <w:r>
+        <w:t>EuropeanScoreTool.exe</w:t>
       </w:r>
     </w:p>
     <w:p>
@@ -77,7 +262,179 @@
         <w:pStyle w:val="Titre2"/>
       </w:pPr>
       <w:r>
-        <w:t>Installation/ Utilisation</w:t>
+        <w:t>Compilation pour les développeurs</w:t>
+      </w:r>
+      <w:r>
+        <w:t>.</w:t>
+      </w:r>
+    </w:p>
+    <w:p>
+      <w:r>
+        <w:t xml:space="preserve">Si vous souhaitez reconstruire cette application, vous devez utiliser </w:t>
+      </w:r>
+      <w:proofErr w:type="spellStart"/>
+      <w:r>
+        <w:t>maven</w:t>
+      </w:r>
+      <w:proofErr w:type="spellEnd"/>
+      <w:r>
+        <w:t xml:space="preserve">. Cette </w:t>
+      </w:r>
+      <w:proofErr w:type="spellStart"/>
+      <w:r>
+        <w:t>contruction</w:t>
+      </w:r>
+      <w:proofErr w:type="spellEnd"/>
+      <w:r>
+        <w:t xml:space="preserve"> se fait en deux </w:t>
+      </w:r>
+      <w:proofErr w:type="spellStart"/>
+      <w:r>
+        <w:t>étapaes</w:t>
+      </w:r>
+      <w:proofErr w:type="spellEnd"/>
+      <w:r>
+        <w:t> :</w:t>
+      </w:r>
+    </w:p>
+    <w:p>
+      <w:pPr>
+        <w:pStyle w:val="Paragraphedeliste"/>
+        <w:numPr>
+          <w:ilvl w:val="0"/>
+          <w:numId w:val="1"/>
+        </w:numPr>
+      </w:pPr>
+      <w:r>
+        <w:t xml:space="preserve">Dans le projet </w:t>
+      </w:r>
+      <w:proofErr w:type="spellStart"/>
+      <w:r>
+        <w:t>org.bpy.socre.build</w:t>
+      </w:r>
+      <w:proofErr w:type="spellEnd"/>
+      <w:r>
+        <w:t xml:space="preserve"> , faite un run-&gt;run as-&gt;</w:t>
+      </w:r>
+      <w:proofErr w:type="spellStart"/>
+      <w:r>
+        <w:t>maven</w:t>
+      </w:r>
+      <w:proofErr w:type="spellEnd"/>
+      <w:r>
+        <w:t xml:space="preserve"> </w:t>
+      </w:r>
+      <w:proofErr w:type="spellStart"/>
+      <w:r>
+        <w:t>install</w:t>
+      </w:r>
+      <w:proofErr w:type="spellEnd"/>
+      <w:r>
+        <w:t xml:space="preserve"> sur le fichier pom.xml</w:t>
+      </w:r>
+    </w:p>
+    <w:p>
+      <w:pPr>
+        <w:pStyle w:val="Paragraphedeliste"/>
+        <w:numPr>
+          <w:ilvl w:val="0"/>
+          <w:numId w:val="1"/>
+        </w:numPr>
+      </w:pPr>
+      <w:r>
+        <w:t xml:space="preserve">Dans le projet </w:t>
+      </w:r>
+      <w:proofErr w:type="spellStart"/>
+      <w:r>
+        <w:t>org.bpy.score.project</w:t>
+      </w:r>
+      <w:proofErr w:type="spellEnd"/>
+      <w:r>
+        <w:t xml:space="preserve"> , faite un run-&gt;run as-&gt;</w:t>
+      </w:r>
+      <w:proofErr w:type="spellStart"/>
+      <w:r>
+        <w:t>maven</w:t>
+      </w:r>
+      <w:proofErr w:type="spellEnd"/>
+      <w:r>
+        <w:t xml:space="preserve"> </w:t>
+      </w:r>
+      <w:proofErr w:type="spellStart"/>
+      <w:r>
+        <w:t>install</w:t>
+      </w:r>
+      <w:proofErr w:type="spellEnd"/>
+      <w:r>
+        <w:t xml:space="preserve"> sur le fichier pom.xml</w:t>
+      </w:r>
+    </w:p>
+    <w:p>
+      <w:pPr>
+        <w:pStyle w:val="Paragraphedeliste"/>
+        <w:numPr>
+          <w:ilvl w:val="0"/>
+          <w:numId w:val="1"/>
+        </w:numPr>
+      </w:pPr>
+      <w:r>
+        <w:t xml:space="preserve">L’application sera alors disponible dans le répertoire </w:t>
+      </w:r>
+      <w:proofErr w:type="spellStart"/>
+      <w:r>
+        <w:t>target</w:t>
+      </w:r>
+      <w:proofErr w:type="spellEnd"/>
+      <w:r>
+        <w:t xml:space="preserve"> sous la forme d’un fichier zip</w:t>
+      </w:r>
+      <w:r>
+        <w:t xml:space="preserve"> dans le répertoire </w:t>
+      </w:r>
+      <w:proofErr w:type="spellStart"/>
+      <w:r>
+        <w:t>org.bpy.score.product</w:t>
+      </w:r>
+      <w:proofErr w:type="spellEnd"/>
+      <w:r>
+        <w:t>\</w:t>
+      </w:r>
+      <w:proofErr w:type="spellStart"/>
+      <w:r>
+        <w:t>target</w:t>
+      </w:r>
+      <w:proofErr w:type="spellEnd"/>
+      <w:r>
+        <w:t>\</w:t>
+      </w:r>
+      <w:proofErr w:type="spellStart"/>
+      <w:r>
+        <w:t>products</w:t>
+      </w:r>
+      <w:proofErr w:type="spellEnd"/>
+      <w:r>
+        <w:t xml:space="preserve">. Le nom de ce fichier est sous la forme  </w:t>
+      </w:r>
+      <w:r>
+        <w:t>ScoreKepperTool_</w:t>
+      </w:r>
+      <w:r>
+        <w:t>x</w:t>
+      </w:r>
+      <w:r>
+        <w:t>.</w:t>
+      </w:r>
+      <w:r>
+        <w:t>x</w:t>
+      </w:r>
+      <w:r>
+        <w:t>.</w:t>
+      </w:r>
+      <w:r>
+        <w:t>x</w:t>
+      </w:r>
+      <w:r>
+        <w:t>-SNAPSHOT.zip</w:t>
       </w:r>
     </w:p>
     <w:p>
@@ -85,15 +442,392 @@
         <w:pStyle w:val="Titre2"/>
       </w:pPr>
       <w:r>
-        <w:t>Compilation pour les développeurs</w:t>
-      </w:r>
-    </w:p>
+        <w:t>Technologies utilisées</w:t>
+      </w:r>
+      <w:r>
+        <w:t>.</w:t>
+      </w:r>
+    </w:p>
+    <w:p>
+      <w:r>
+        <w:t>Voici les principaux outils utilisés</w:t>
+      </w:r>
+    </w:p>
+    <w:tbl>
+      <w:tblPr>
+        <w:tblStyle w:val="Grilledutableau"/>
+        <w:tblW w:w="0" w:type="auto"/>
+        <w:tblLook w:val="04A0" w:firstRow="1" w:lastRow="0" w:firstColumn="1" w:lastColumn="0" w:noHBand="0" w:noVBand="1"/>
+      </w:tblPr>
+      <w:tblGrid>
+        <w:gridCol w:w="1838"/>
+        <w:gridCol w:w="7224"/>
+      </w:tblGrid>
+      <w:tr>
+        <w:tc>
+          <w:tcPr>
+            <w:tcW w:w="1838" w:type="dxa"/>
+          </w:tcPr>
+          <w:p>
+            <w:r>
+              <w:t>Java</w:t>
+            </w:r>
+          </w:p>
+        </w:tc>
+        <w:tc>
+          <w:tcPr>
+            <w:tcW w:w="7224" w:type="dxa"/>
+          </w:tcPr>
+          <w:p>
+            <w:r>
+              <w:t>Java 17</w:t>
+            </w:r>
+          </w:p>
+        </w:tc>
+      </w:tr>
+      <w:tr>
+        <w:tc>
+          <w:tcPr>
+            <w:tcW w:w="1838" w:type="dxa"/>
+          </w:tcPr>
+          <w:p>
+            <w:r>
+              <w:t>Edition</w:t>
+            </w:r>
+          </w:p>
+        </w:tc>
+        <w:tc>
+          <w:tcPr>
+            <w:tcW w:w="7224" w:type="dxa"/>
+          </w:tcPr>
+          <w:p>
+            <w:r>
+              <w:t>Ec</w:t>
+            </w:r>
+            <w:r>
+              <w:t>lipse</w:t>
+            </w:r>
+            <w:r>
+              <w:t xml:space="preserve"> 2023-06 </w:t>
+            </w:r>
+            <w:r>
+              <w:t>développeur DSL</w:t>
+            </w:r>
+          </w:p>
+        </w:tc>
+      </w:tr>
+      <w:tr>
+        <w:tc>
+          <w:tcPr>
+            <w:tcW w:w="1838" w:type="dxa"/>
+          </w:tcPr>
+          <w:p>
+            <w:proofErr w:type="spellStart"/>
+            <w:r>
+              <w:t>Build</w:t>
+            </w:r>
+            <w:proofErr w:type="spellEnd"/>
+          </w:p>
+        </w:tc>
+        <w:tc>
+          <w:tcPr>
+            <w:tcW w:w="7224" w:type="dxa"/>
+          </w:tcPr>
+          <w:p>
+            <w:r>
+              <w:t>Maven</w:t>
+            </w:r>
+          </w:p>
+        </w:tc>
+      </w:tr>
+    </w:tbl>
+    <w:p/>
+    <w:p>
+      <w:r>
+        <w:t xml:space="preserve">Liste des plugins utilisés sous </w:t>
+      </w:r>
+      <w:proofErr w:type="spellStart"/>
+      <w:r>
+        <w:t>eclipse</w:t>
+      </w:r>
+      <w:proofErr w:type="spellEnd"/>
+      <w:r>
+        <w:t xml:space="preserve">. </w:t>
+      </w:r>
+    </w:p>
+    <w:tbl>
+      <w:tblPr>
+        <w:tblStyle w:val="Grilledutableau"/>
+        <w:tblW w:w="0" w:type="auto"/>
+        <w:tblLook w:val="04A0" w:firstRow="1" w:lastRow="0" w:firstColumn="1" w:lastColumn="0" w:noHBand="0" w:noVBand="1"/>
+      </w:tblPr>
+      <w:tblGrid>
+        <w:gridCol w:w="1838"/>
+        <w:gridCol w:w="7224"/>
+      </w:tblGrid>
+      <w:tr>
+        <w:tc>
+          <w:tcPr>
+            <w:tcW w:w="1838" w:type="dxa"/>
+          </w:tcPr>
+          <w:p>
+            <w:proofErr w:type="spellStart"/>
+            <w:r>
+              <w:t>WindowBuilder</w:t>
+            </w:r>
+            <w:proofErr w:type="spellEnd"/>
+          </w:p>
+        </w:tc>
+        <w:tc>
+          <w:tcPr>
+            <w:tcW w:w="7224" w:type="dxa"/>
+          </w:tcPr>
+          <w:p>
+            <w:r>
+              <w:t>Edition des interfaces graphiques</w:t>
+            </w:r>
+          </w:p>
+        </w:tc>
+      </w:tr>
+      <w:tr>
+        <w:tc>
+          <w:tcPr>
+            <w:tcW w:w="1838" w:type="dxa"/>
+          </w:tcPr>
+          <w:p>
+            <w:proofErr w:type="spellStart"/>
+            <w:r>
+              <w:t>Sonarlint</w:t>
+            </w:r>
+            <w:proofErr w:type="spellEnd"/>
+          </w:p>
+        </w:tc>
+        <w:tc>
+          <w:tcPr>
+            <w:tcW w:w="7224" w:type="dxa"/>
+          </w:tcPr>
+          <w:p>
+            <w:r>
+              <w:t>Analyse de la qualité du code</w:t>
+            </w:r>
+          </w:p>
+        </w:tc>
+      </w:tr>
+      <w:tr>
+        <w:tc>
+          <w:tcPr>
+            <w:tcW w:w="1838" w:type="dxa"/>
+          </w:tcPr>
+          <w:p>
+            <w:proofErr w:type="spellStart"/>
+            <w:r>
+              <w:t>XText</w:t>
+            </w:r>
+            <w:proofErr w:type="spellEnd"/>
+          </w:p>
+        </w:tc>
+        <w:tc>
+          <w:tcPr>
+            <w:tcW w:w="7224" w:type="dxa"/>
+          </w:tcPr>
+          <w:p>
+            <w:r>
+              <w:t>Définition des deux éditeurs</w:t>
+            </w:r>
+          </w:p>
+        </w:tc>
+      </w:tr>
+      <w:tr>
+        <w:tc>
+          <w:tcPr>
+            <w:tcW w:w="1838" w:type="dxa"/>
+          </w:tcPr>
+          <w:p>
+            <w:r>
+              <w:t>Git</w:t>
+            </w:r>
+          </w:p>
+        </w:tc>
+        <w:tc>
+          <w:tcPr>
+            <w:tcW w:w="7224" w:type="dxa"/>
+          </w:tcPr>
+          <w:p>
+            <w:r>
+              <w:t>Gestion de configuration</w:t>
+            </w:r>
+          </w:p>
+        </w:tc>
+      </w:tr>
+    </w:tbl>
+    <w:p/>
+    <w:p>
+      <w:r>
+        <w:t xml:space="preserve">Langages utilisés. </w:t>
+      </w:r>
+    </w:p>
+    <w:tbl>
+      <w:tblPr>
+        <w:tblStyle w:val="Grilledutableau"/>
+        <w:tblW w:w="0" w:type="auto"/>
+        <w:tblLook w:val="04A0" w:firstRow="1" w:lastRow="0" w:firstColumn="1" w:lastColumn="0" w:noHBand="0" w:noVBand="1"/>
+      </w:tblPr>
+      <w:tblGrid>
+        <w:gridCol w:w="1838"/>
+        <w:gridCol w:w="7224"/>
+      </w:tblGrid>
+      <w:tr>
+        <w:tc>
+          <w:tcPr>
+            <w:tcW w:w="1838" w:type="dxa"/>
+          </w:tcPr>
+          <w:p>
+            <w:r>
+              <w:t>Java</w:t>
+            </w:r>
+          </w:p>
+        </w:tc>
+        <w:tc>
+          <w:tcPr>
+            <w:tcW w:w="7224" w:type="dxa"/>
+          </w:tcPr>
+          <w:p>
+            <w:r>
+              <w:t>Code de l’application</w:t>
+            </w:r>
+          </w:p>
+        </w:tc>
+      </w:tr>
+      <w:tr>
+        <w:tc>
+          <w:tcPr>
+            <w:tcW w:w="1838" w:type="dxa"/>
+          </w:tcPr>
+          <w:p>
+            <w:proofErr w:type="spellStart"/>
+            <w:r>
+              <w:t>Xtend</w:t>
+            </w:r>
+            <w:proofErr w:type="spellEnd"/>
+          </w:p>
+        </w:tc>
+        <w:tc>
+          <w:tcPr>
+            <w:tcW w:w="7224" w:type="dxa"/>
+          </w:tcPr>
+          <w:p>
+            <w:r>
+              <w:t>Tests unitaires</w:t>
+            </w:r>
+          </w:p>
+        </w:tc>
+      </w:tr>
+      <w:tr>
+        <w:tc>
+          <w:tcPr>
+            <w:tcW w:w="1838" w:type="dxa"/>
+          </w:tcPr>
+          <w:p>
+            <w:proofErr w:type="spellStart"/>
+            <w:r>
+              <w:t>XText</w:t>
+            </w:r>
+            <w:proofErr w:type="spellEnd"/>
+          </w:p>
+        </w:tc>
+        <w:tc>
+          <w:tcPr>
+            <w:tcW w:w="7224" w:type="dxa"/>
+          </w:tcPr>
+          <w:p>
+            <w:r>
+              <w:t xml:space="preserve">Description du langage </w:t>
+            </w:r>
+            <w:r>
+              <w:t>des éditeurs</w:t>
+            </w:r>
+          </w:p>
+        </w:tc>
+      </w:tr>
+      <w:tr>
+        <w:tc>
+          <w:tcPr>
+            <w:tcW w:w="1838" w:type="dxa"/>
+          </w:tcPr>
+          <w:p>
+            <w:proofErr w:type="spellStart"/>
+            <w:r>
+              <w:t>Markdown</w:t>
+            </w:r>
+            <w:proofErr w:type="spellEnd"/>
+          </w:p>
+        </w:tc>
+        <w:tc>
+          <w:tcPr>
+            <w:tcW w:w="7224" w:type="dxa"/>
+          </w:tcPr>
+          <w:p>
+            <w:r>
+              <w:t>Cette documentation</w:t>
+            </w:r>
+          </w:p>
+        </w:tc>
+      </w:tr>
+      <w:tr>
+        <w:tc>
+          <w:tcPr>
+            <w:tcW w:w="1838" w:type="dxa"/>
+          </w:tcPr>
+          <w:p>
+            <w:r>
+              <w:t>Html</w:t>
+            </w:r>
+          </w:p>
+        </w:tc>
+        <w:tc>
+          <w:tcPr>
+            <w:tcW w:w="7224" w:type="dxa"/>
+          </w:tcPr>
+          <w:p>
+            <w:r>
+              <w:t>Aide sur l’application</w:t>
+            </w:r>
+          </w:p>
+        </w:tc>
+      </w:tr>
+      <w:tr>
+        <w:tc>
+          <w:tcPr>
+            <w:tcW w:w="1838" w:type="dxa"/>
+          </w:tcPr>
+          <w:p>
+            <w:r>
+              <w:t>XML</w:t>
+            </w:r>
+          </w:p>
+        </w:tc>
+        <w:tc>
+          <w:tcPr>
+            <w:tcW w:w="7224" w:type="dxa"/>
+          </w:tcPr>
+          <w:p>
+            <w:r>
+              <w:t>Fichiers de description des projets</w:t>
+            </w:r>
+          </w:p>
+        </w:tc>
+      </w:tr>
+    </w:tbl>
     <w:p>
       <w:pPr>
         <w:pStyle w:val="Titre2"/>
       </w:pPr>
       <w:r>
-        <w:t>Technologies utilisées</w:t>
+        <w:lastRenderedPageBreak/>
+        <w:t>Contribuer / signaler un bug</w:t>
+      </w:r>
+      <w:r>
+        <w:t>.</w:t>
       </w:r>
     </w:p>
     <w:p>
@@ -101,7 +835,10 @@
         <w:pStyle w:val="Titre2"/>
       </w:pPr>
       <w:r>
-        <w:t>Documentation</w:t>
+        <w:t>Licence</w:t>
+      </w:r>
+      <w:r>
+        <w:t>.</w:t>
       </w:r>
     </w:p>
     <w:p>
@@ -109,7 +846,10 @@
         <w:pStyle w:val="Titre2"/>
       </w:pPr>
       <w:r>
-        <w:t>Contribuer / signaler un bug</w:t>
+        <w:t>Limitations</w:t>
+      </w:r>
+      <w:r>
+        <w:t>.</w:t>
       </w:r>
     </w:p>
     <w:p>
@@ -117,7 +857,10 @@
         <w:pStyle w:val="Titre2"/>
       </w:pPr>
       <w:r>
-        <w:t>Licence</w:t>
+        <w:t>Contact ou auteur</w:t>
+      </w:r>
+      <w:r>
+        <w:t>.</w:t>
       </w:r>
     </w:p>
     <w:p>
@@ -125,15 +868,7 @@
         <w:pStyle w:val="Titre2"/>
       </w:pPr>
       <w:r>
-        <w:t>Limitations</w:t>
-      </w:r>
-    </w:p>
-    <w:p>
-      <w:pPr>
-        <w:pStyle w:val="Titre2"/>
-      </w:pPr>
-      <w:r>
-        <w:t>Contact ou auteur</w:t>
+        <w:t>Versions</w:t>
       </w:r>
     </w:p>
     <w:p>
@@ -155,6 +890,126 @@
     </w:sectPr>
   </w:body>
 </w:document>
+</file>
+
+<file path=word/numbering.xml><?xml version="1.0" encoding="utf-8"?>
+<w:numbering xmlns:wpc="http://schemas.microsoft.com/office/word/2010/wordprocessingCanvas" xmlns:cx="http://schemas.microsoft.com/office/drawing/2014/chartex" xmlns:cx1="http://schemas.microsoft.com/office/drawing/2015/9/8/chartex" xmlns:cx2="http://schemas.microsoft.com/office/drawing/2015/10/21/chartex" xmlns:cx3="http://schemas.microsoft.com/office/drawing/2016/5/9/chartex" xmlns:cx4="http://schemas.microsoft.com/office/drawing/2016/5/10/chartex" xmlns:cx5="http://schemas.microsoft.com/office/drawing/2016/5/11/chartex" xmlns:cx6="http://schemas.microsoft.com/office/drawing/2016/5/12/chartex" xmlns:cx7="http://schemas.microsoft.com/office/drawing/2016/5/13/chartex" xmlns:cx8="http://schemas.microsoft.com/office/drawing/2016/5/14/chartex" xmlns:mc="http://schemas.openxmlformats.org/markup-compatibility/2006" xmlns:aink="http://schemas.microsoft.com/office/drawing/2016/ink" xmlns:am3d="http://schemas.microsoft.com/office/drawing/2017/model3d" xmlns:o="urn:schemas-microsoft-com:office:office" xmlns:oel="http://schemas.microsoft.com/office/2019/extlst" xmlns:r="http://schemas.openxmlformats.org/officeDocument/2006/relationships" xmlns:m="http://schemas.openxmlformats.org/officeDocument/2006/math" xmlns:v="urn:schemas-microsoft-com:vml" xmlns:wp14="http://schemas.microsoft.com/office/word/2010/wordprocessingDrawing" xmlns:wp="http://schemas.openxmlformats.org/drawingml/2006/wordprocessingDrawing" xmlns:w10="urn:schemas-microsoft-com:office:word" xmlns:w="http://schemas.openxmlformats.org/wordprocessingml/2006/main" xmlns:w14="http://schemas.microsoft.com/office/word/2010/wordml" xmlns:w15="http://schemas.microsoft.com/office/word/2012/wordml" xmlns:w16cex="http://schemas.microsoft.com/office/word/2018/wordml/cex" xmlns:w16cid="http://schemas.microsoft.com/office/word/2016/wordml/cid" xmlns:w16="http://schemas.microsoft.com/office/word/2018/wordml" xmlns:w16du="http://schemas.microsoft.com/office/word/2023/wordml/word16du" xmlns:w16sdtdh="http://schemas.microsoft.com/office/word/2020/wordml/sdtdatahash" xmlns:w16sdtfl="http://schemas.microsoft.com/office/word/2024/wordml/sdtformatlock" xmlns:w16se="http://schemas.microsoft.com/office/word/2015/wordml/symex" xmlns:wpg="http://schemas.microsoft.com/office/word/2010/wordprocessingGroup" xmlns:wpi="http://schemas.microsoft.com/office/word/2010/wordprocessingInk" xmlns:wne="http://schemas.microsoft.com/office/word/2006/wordml" xmlns:wps="http://schemas.microsoft.com/office/word/2010/wordprocessingShape" mc:Ignorable="w14 w15 w16se w16cid w16 w16cex w16sdtdh w16sdtfl w16du wp14">
+  <w:abstractNum w:abstractNumId="0" w15:restartNumberingAfterBreak="0">
+    <w:nsid w:val="08B40511"/>
+    <w:multiLevelType w:val="hybridMultilevel"/>
+    <w:tmpl w:val="F9D04642"/>
+    <w:lvl w:ilvl="0" w:tplc="90E04628">
+      <w:numFmt w:val="bullet"/>
+      <w:lvlText w:val="-"/>
+      <w:lvlJc w:val="left"/>
+      <w:pPr>
+        <w:ind w:left="720" w:hanging="360"/>
+      </w:pPr>
+      <w:rPr>
+        <w:rFonts w:ascii="Calibri" w:eastAsiaTheme="minorHAnsi" w:hAnsi="Calibri" w:cs="Calibri" w:hint="default"/>
+      </w:rPr>
+    </w:lvl>
+    <w:lvl w:ilvl="1" w:tplc="040C0003" w:tentative="1">
+      <w:start w:val="1"/>
+      <w:numFmt w:val="bullet"/>
+      <w:lvlText w:val="o"/>
+      <w:lvlJc w:val="left"/>
+      <w:pPr>
+        <w:ind w:left="1440" w:hanging="360"/>
+      </w:pPr>
+      <w:rPr>
+        <w:rFonts w:ascii="Courier New" w:hAnsi="Courier New" w:cs="Courier New" w:hint="default"/>
+      </w:rPr>
+    </w:lvl>
+    <w:lvl w:ilvl="2" w:tplc="040C0005" w:tentative="1">
+      <w:start w:val="1"/>
+      <w:numFmt w:val="bullet"/>
+      <w:lvlText w:val=""/>
+      <w:lvlJc w:val="left"/>
+      <w:pPr>
+        <w:ind w:left="2160" w:hanging="360"/>
+      </w:pPr>
+      <w:rPr>
+        <w:rFonts w:ascii="Wingdings" w:hAnsi="Wingdings" w:hint="default"/>
+      </w:rPr>
+    </w:lvl>
+    <w:lvl w:ilvl="3" w:tplc="040C0001" w:tentative="1">
+      <w:start w:val="1"/>
+      <w:numFmt w:val="bullet"/>
+      <w:lvlText w:val=""/>
+      <w:lvlJc w:val="left"/>
+      <w:pPr>
+        <w:ind w:left="2880" w:hanging="360"/>
+      </w:pPr>
+      <w:rPr>
+        <w:rFonts w:ascii="Symbol" w:hAnsi="Symbol" w:hint="default"/>
+      </w:rPr>
+    </w:lvl>
+    <w:lvl w:ilvl="4" w:tplc="040C0003" w:tentative="1">
+      <w:start w:val="1"/>
+      <w:numFmt w:val="bullet"/>
+      <w:lvlText w:val="o"/>
+      <w:lvlJc w:val="left"/>
+      <w:pPr>
+        <w:ind w:left="3600" w:hanging="360"/>
+      </w:pPr>
+      <w:rPr>
+        <w:rFonts w:ascii="Courier New" w:hAnsi="Courier New" w:cs="Courier New" w:hint="default"/>
+      </w:rPr>
+    </w:lvl>
+    <w:lvl w:ilvl="5" w:tplc="040C0005" w:tentative="1">
+      <w:start w:val="1"/>
+      <w:numFmt w:val="bullet"/>
+      <w:lvlText w:val=""/>
+      <w:lvlJc w:val="left"/>
+      <w:pPr>
+        <w:ind w:left="4320" w:hanging="360"/>
+      </w:pPr>
+      <w:rPr>
+        <w:rFonts w:ascii="Wingdings" w:hAnsi="Wingdings" w:hint="default"/>
+      </w:rPr>
+    </w:lvl>
+    <w:lvl w:ilvl="6" w:tplc="040C0001" w:tentative="1">
+      <w:start w:val="1"/>
+      <w:numFmt w:val="bullet"/>
+      <w:lvlText w:val=""/>
+      <w:lvlJc w:val="left"/>
+      <w:pPr>
+        <w:ind w:left="5040" w:hanging="360"/>
+      </w:pPr>
+      <w:rPr>
+        <w:rFonts w:ascii="Symbol" w:hAnsi="Symbol" w:hint="default"/>
+      </w:rPr>
+    </w:lvl>
+    <w:lvl w:ilvl="7" w:tplc="040C0003" w:tentative="1">
+      <w:start w:val="1"/>
+      <w:numFmt w:val="bullet"/>
+      <w:lvlText w:val="o"/>
+      <w:lvlJc w:val="left"/>
+      <w:pPr>
+        <w:ind w:left="5760" w:hanging="360"/>
+      </w:pPr>
+      <w:rPr>
+        <w:rFonts w:ascii="Courier New" w:hAnsi="Courier New" w:cs="Courier New" w:hint="default"/>
+      </w:rPr>
+    </w:lvl>
+    <w:lvl w:ilvl="8" w:tplc="040C0005" w:tentative="1">
+      <w:start w:val="1"/>
+      <w:numFmt w:val="bullet"/>
+      <w:lvlText w:val=""/>
+      <w:lvlJc w:val="left"/>
+      <w:pPr>
+        <w:ind w:left="6480" w:hanging="360"/>
+      </w:pPr>
+      <w:rPr>
+        <w:rFonts w:ascii="Wingdings" w:hAnsi="Wingdings" w:hint="default"/>
+      </w:rPr>
+    </w:lvl>
+  </w:abstractNum>
+  <w:num w:numId="1" w16cid:durableId="2025470894">
+    <w:abstractNumId w:val="0"/>
+  </w:num>
+</w:numbering>
 </file>
 
 <file path=word/styles.xml><?xml version="1.0" encoding="utf-8"?>
@@ -759,6 +1614,7 @@
   <w:style w:type="character" w:default="1" w:styleId="Policepardfaut">
     <w:name w:val="Default Paragraph Font"/>
     <w:uiPriority w:val="1"/>
+    <w:semiHidden/>
     <w:unhideWhenUsed/>
   </w:style>
   <w:style w:type="table" w:default="1" w:styleId="TableauNormal">
@@ -1070,6 +1926,25 @@
       <w:color w:val="2F5496" w:themeColor="accent1" w:themeShade="BF"/>
       <w:spacing w:val="5"/>
     </w:rPr>
+  </w:style>
+  <w:style w:type="table" w:styleId="Grilledutableau">
+    <w:name w:val="Table Grid"/>
+    <w:basedOn w:val="TableauNormal"/>
+    <w:uiPriority w:val="39"/>
+    <w:rsid w:val="00F04EDA"/>
+    <w:pPr>
+      <w:spacing w:after="0" w:line="240" w:lineRule="auto"/>
+    </w:pPr>
+    <w:tblPr>
+      <w:tblBorders>
+        <w:top w:val="single" w:sz="4" w:space="0" w:color="auto"/>
+        <w:left w:val="single" w:sz="4" w:space="0" w:color="auto"/>
+        <w:bottom w:val="single" w:sz="4" w:space="0" w:color="auto"/>
+        <w:right w:val="single" w:sz="4" w:space="0" w:color="auto"/>
+        <w:insideH w:val="single" w:sz="4" w:space="0" w:color="auto"/>
+        <w:insideV w:val="single" w:sz="4" w:space="0" w:color="auto"/>
+      </w:tblBorders>
+    </w:tblPr>
   </w:style>
 </w:styles>
 </file>

</xml_diff>

<commit_message>
Set the english version of the readme.md file
</commit_message>
<xml_diff>
--- a/docs/markdown_fr.docx
+++ b/docs/markdown_fr.docx
@@ -234,6 +234,11 @@
       </w:r>
     </w:p>
     <w:p>
+      <w:r>
+        <w:t>L‘application vous permet aussi d’importer le championnat de D1 2019 qui sera une aide pour comprendre le fonctionnement de cette application.</w:t>
+      </w:r>
+    </w:p>
+    <w:p>
       <w:pPr>
         <w:pStyle w:val="Titre2"/>
       </w:pPr>
@@ -278,23 +283,13 @@
       </w:r>
       <w:proofErr w:type="spellEnd"/>
       <w:r>
-        <w:t xml:space="preserve">. Cette </w:t>
-      </w:r>
-      <w:proofErr w:type="spellStart"/>
-      <w:r>
-        <w:t>contruction</w:t>
-      </w:r>
-      <w:proofErr w:type="spellEnd"/>
-      <w:r>
-        <w:t xml:space="preserve"> se fait en deux </w:t>
-      </w:r>
-      <w:proofErr w:type="spellStart"/>
-      <w:r>
-        <w:t>étapaes</w:t>
-      </w:r>
-      <w:proofErr w:type="spellEnd"/>
-      <w:r>
-        <w:t> :</w:t>
+        <w:t>. Cette con</w:t>
+      </w:r>
+      <w:r>
+        <w:t>s</w:t>
+      </w:r>
+      <w:r>
+        <w:t>truction se fait en deux étapes :</w:t>
       </w:r>
     </w:p>
     <w:p>
@@ -309,12 +304,25 @@
         <w:t xml:space="preserve">Dans le projet </w:t>
       </w:r>
       <w:proofErr w:type="spellStart"/>
-      <w:r>
-        <w:t>org.bpy.socre.build</w:t>
+      <w:proofErr w:type="gramStart"/>
+      <w:r>
+        <w:t>org.bpy.socre</w:t>
+      </w:r>
+      <w:proofErr w:type="gramEnd"/>
+      <w:r>
+        <w:t>.</w:t>
+      </w:r>
+      <w:proofErr w:type="gramStart"/>
+      <w:r>
+        <w:t>build</w:t>
       </w:r>
       <w:proofErr w:type="spellEnd"/>
       <w:r>
-        <w:t xml:space="preserve"> , faite un run-&gt;run as-&gt;</w:t>
+        <w:t xml:space="preserve"> ,</w:t>
+      </w:r>
+      <w:proofErr w:type="gramEnd"/>
+      <w:r>
+        <w:t xml:space="preserve"> faite un run-&gt;run as-&gt;</w:t>
       </w:r>
       <w:proofErr w:type="spellStart"/>
       <w:r>
@@ -345,12 +353,25 @@
         <w:t xml:space="preserve">Dans le projet </w:t>
       </w:r>
       <w:proofErr w:type="spellStart"/>
-      <w:r>
-        <w:t>org.bpy.score.project</w:t>
+      <w:proofErr w:type="gramStart"/>
+      <w:r>
+        <w:t>org.bpy.score</w:t>
+      </w:r>
+      <w:proofErr w:type="gramEnd"/>
+      <w:r>
+        <w:t>.</w:t>
+      </w:r>
+      <w:proofErr w:type="gramStart"/>
+      <w:r>
+        <w:t>project</w:t>
       </w:r>
       <w:proofErr w:type="spellEnd"/>
       <w:r>
-        <w:t xml:space="preserve"> , faite un run-&gt;run as-&gt;</w:t>
+        <w:t xml:space="preserve"> ,</w:t>
+      </w:r>
+      <w:proofErr w:type="gramEnd"/>
+      <w:r>
+        <w:t xml:space="preserve"> faite un run-&gt;run as-&gt;</w:t>
       </w:r>
       <w:proofErr w:type="spellStart"/>
       <w:r>
@@ -392,8 +413,13 @@
         <w:t xml:space="preserve"> dans le répertoire </w:t>
       </w:r>
       <w:proofErr w:type="spellStart"/>
-      <w:r>
-        <w:t>org.bpy.score.product</w:t>
+      <w:proofErr w:type="gramStart"/>
+      <w:r>
+        <w:t>org.bpy.score</w:t>
+      </w:r>
+      <w:proofErr w:type="gramEnd"/>
+      <w:r>
+        <w:t>.product</w:t>
       </w:r>
       <w:proofErr w:type="spellEnd"/>
       <w:r>
@@ -413,7 +439,11 @@
       </w:r>
       <w:proofErr w:type="spellEnd"/>
       <w:r>
-        <w:t xml:space="preserve">. Le nom de ce fichier est sous la forme  </w:t>
+        <w:t xml:space="preserve">. Le nom de ce fichier est sous la </w:t>
+      </w:r>
+      <w:proofErr w:type="gramStart"/>
+      <w:r>
+        <w:t xml:space="preserve">forme  </w:t>
       </w:r>
       <w:r>
         <w:t>ScoreKepperTool_</w:t>
@@ -436,6 +466,7 @@
       <w:r>
         <w:t>-SNAPSHOT.zip</w:t>
       </w:r>
+      <w:proofErr w:type="gramEnd"/>
     </w:p>
     <w:p>
       <w:pPr>
@@ -757,6 +788,7 @@
           <w:p>
             <w:proofErr w:type="spellStart"/>
             <w:r>
+              <w:lastRenderedPageBreak/>
               <w:t>Markdown</w:t>
             </w:r>
             <w:proofErr w:type="spellEnd"/>
@@ -823,41 +855,164 @@
         <w:pStyle w:val="Titre2"/>
       </w:pPr>
       <w:r>
-        <w:lastRenderedPageBreak/>
-        <w:t>Contribuer / signaler un bug</w:t>
+        <w:t>Licence</w:t>
       </w:r>
       <w:r>
         <w:t>.</w:t>
       </w:r>
     </w:p>
     <w:p>
+      <w:r>
+        <w:t xml:space="preserve">Ce logiciel est sous License GPL-3.0. </w:t>
+      </w:r>
+      <w:proofErr w:type="gramStart"/>
+      <w:r>
+        <w:t>cela</w:t>
+      </w:r>
+      <w:proofErr w:type="gramEnd"/>
+      <w:r>
+        <w:t xml:space="preserve"> signifie que vous pouvez l’utiliser librement, récupérer les sources pour apporter des améliorations (ce serait sympa de m’en faire profiter</w:t>
+      </w:r>
+      <w:proofErr w:type="gramStart"/>
+      <w:r>
+        <w:t>) ,</w:t>
+      </w:r>
+      <w:proofErr w:type="gramEnd"/>
+      <w:r>
+        <w:t xml:space="preserve"> mais par contre, vous interdit d’en faire un usage commercial sans mon autorisation.</w:t>
+      </w:r>
+    </w:p>
+    <w:p>
       <w:pPr>
         <w:pStyle w:val="Titre2"/>
       </w:pPr>
       <w:r>
-        <w:t>Licence</w:t>
+        <w:t>Limitations</w:t>
       </w:r>
       <w:r>
         <w:t>.</w:t>
       </w:r>
     </w:p>
     <w:p>
+      <w:r>
+        <w:t>Ce logiciel est toujours en cours de développement, il y a donc des limitations dans son utilisation.</w:t>
+      </w:r>
+    </w:p>
+    <w:p>
+      <w:pPr>
+        <w:pStyle w:val="Paragraphedeliste"/>
+        <w:numPr>
+          <w:ilvl w:val="0"/>
+          <w:numId w:val="1"/>
+        </w:numPr>
+      </w:pPr>
+      <w:r>
+        <w:t>La génération de rapports n’est pas encore complète.</w:t>
+      </w:r>
+    </w:p>
+    <w:p>
+      <w:pPr>
+        <w:pStyle w:val="Paragraphedeliste"/>
+        <w:numPr>
+          <w:ilvl w:val="0"/>
+          <w:numId w:val="1"/>
+        </w:numPr>
+      </w:pPr>
+      <w:r>
+        <w:t>Le logiciel ne prend pas en compte les changements spécifiques au softball.</w:t>
+      </w:r>
+    </w:p>
+    <w:p>
+      <w:pPr>
+        <w:pStyle w:val="Paragraphedeliste"/>
+        <w:numPr>
+          <w:ilvl w:val="0"/>
+          <w:numId w:val="1"/>
+        </w:numPr>
+      </w:pPr>
+      <w:r>
+        <w:t xml:space="preserve">Le logiciel ne </w:t>
+      </w:r>
+      <w:r>
+        <w:t>gère pas la feuille supplémentaire lorsqu’il y a eu plus de 12 manches ou trop de changements.</w:t>
+      </w:r>
+    </w:p>
+    <w:p>
+      <w:pPr>
+        <w:pStyle w:val="Paragraphedeliste"/>
+        <w:numPr>
+          <w:ilvl w:val="0"/>
+          <w:numId w:val="1"/>
+        </w:numPr>
+      </w:pPr>
+      <w:r>
+        <w:t xml:space="preserve">Il existe quelques problèmes qui ne sont pas encore résolus. </w:t>
+      </w:r>
+    </w:p>
+    <w:p>
       <w:pPr>
         <w:pStyle w:val="Titre2"/>
       </w:pPr>
       <w:r>
-        <w:t>Limitations</w:t>
+        <w:t>Contact ou auteur</w:t>
       </w:r>
       <w:r>
         <w:t>.</w:t>
       </w:r>
     </w:p>
     <w:p>
+      <w:r>
+        <w:t>Si vous souhaitez me signaler des disfonctionnements, vous avez deux solutions :</w:t>
+      </w:r>
+    </w:p>
+    <w:p>
+      <w:pPr>
+        <w:pStyle w:val="Paragraphedeliste"/>
+        <w:numPr>
+          <w:ilvl w:val="0"/>
+          <w:numId w:val="1"/>
+        </w:numPr>
+      </w:pPr>
+      <w:r>
+        <w:t xml:space="preserve">Ouvrir une issue sous </w:t>
+      </w:r>
+      <w:proofErr w:type="spellStart"/>
+      <w:r>
+        <w:t>github</w:t>
+      </w:r>
+      <w:proofErr w:type="spellEnd"/>
+      <w:r>
+        <w:t xml:space="preserve"> en me décrivant le plus explicitement le problème rencontré.</w:t>
+      </w:r>
+    </w:p>
+    <w:p>
+      <w:pPr>
+        <w:pStyle w:val="Paragraphedeliste"/>
+        <w:numPr>
+          <w:ilvl w:val="0"/>
+          <w:numId w:val="1"/>
+        </w:numPr>
+      </w:pPr>
+      <w:r>
+        <w:t xml:space="preserve">Ou m’envoyé un mail à </w:t>
+      </w:r>
+      <w:proofErr w:type="spellStart"/>
+      <w:proofErr w:type="gramStart"/>
+      <w:r>
+        <w:t>briand.patrick</w:t>
+      </w:r>
+      <w:proofErr w:type="spellEnd"/>
+      <w:proofErr w:type="gramEnd"/>
+      <w:r>
+        <w:t xml:space="preserve"> arrobase free.fr</w:t>
+      </w:r>
+    </w:p>
+    <w:p>
       <w:pPr>
         <w:pStyle w:val="Titre2"/>
       </w:pPr>
       <w:r>
-        <w:t>Contact ou auteur</w:t>
+        <w:t>Versions</w:t>
       </w:r>
       <w:r>
         <w:t>.</w:t>
@@ -867,9 +1022,6 @@
       <w:pPr>
         <w:pStyle w:val="Titre2"/>
       </w:pPr>
-      <w:r>
-        <w:t>Versions</w:t>
-      </w:r>
     </w:p>
     <w:p>
       <w:pPr>

</xml_diff>